<commit_message>
Aqui agregue la idea del proyecto final
</commit_message>
<xml_diff>
--- a/Commit 2.docx
+++ b/Commit 2.docx
@@ -1844,6 +1844,276 @@
           <w:szCs w:val="32"/>
         </w:rPr>
       </w:pPr>
+    </w:p>
+    <w:p>
+      <w:pPr>
+        <w:pStyle w:val="Normal"/>
+        <w:ind w:left="0"/>
+        <w:jc w:val="left"/>
+        <w:rPr>
+          <w:b w:val="1"/>
+          <w:bCs w:val="1"/>
+          <w:sz w:val="32"/>
+          <w:szCs w:val="32"/>
+        </w:rPr>
+      </w:pPr>
+    </w:p>
+    <w:p>
+      <w:pPr>
+        <w:pStyle w:val="Normal"/>
+        <w:ind w:left="0"/>
+        <w:jc w:val="left"/>
+        <w:rPr>
+          <w:b w:val="1"/>
+          <w:bCs w:val="1"/>
+          <w:sz w:val="32"/>
+          <w:szCs w:val="32"/>
+        </w:rPr>
+      </w:pPr>
+    </w:p>
+    <w:p>
+      <w:pPr>
+        <w:pStyle w:val="Normal"/>
+        <w:ind w:left="0"/>
+        <w:jc w:val="left"/>
+        <w:rPr>
+          <w:b w:val="1"/>
+          <w:bCs w:val="1"/>
+          <w:sz w:val="32"/>
+          <w:szCs w:val="32"/>
+        </w:rPr>
+      </w:pPr>
+    </w:p>
+    <w:p>
+      <w:pPr>
+        <w:pStyle w:val="Normal"/>
+        <w:ind w:left="0"/>
+        <w:jc w:val="left"/>
+        <w:rPr>
+          <w:b w:val="1"/>
+          <w:bCs w:val="1"/>
+          <w:sz w:val="32"/>
+          <w:szCs w:val="32"/>
+        </w:rPr>
+      </w:pPr>
+    </w:p>
+    <w:p>
+      <w:pPr>
+        <w:pStyle w:val="Normal"/>
+        <w:ind w:left="0"/>
+        <w:jc w:val="left"/>
+        <w:rPr>
+          <w:b w:val="1"/>
+          <w:bCs w:val="1"/>
+          <w:sz w:val="32"/>
+          <w:szCs w:val="32"/>
+        </w:rPr>
+      </w:pPr>
+    </w:p>
+    <w:p>
+      <w:r>
+        <w:br w:type="page"/>
+      </w:r>
+    </w:p>
+    <w:p>
+      <w:pPr>
+        <w:pStyle w:val="Normal"/>
+        <w:ind w:left="0"/>
+        <w:jc w:val="left"/>
+      </w:pPr>
+      <w:r>
+        <w:rPr>
+          <w:b w:val="1"/>
+          <w:bCs w:val="1"/>
+          <w:sz w:val="32"/>
+          <w:szCs w:val="32"/>
+        </w:rPr>
+        <w:t>Martes</w:t>
+      </w:r>
+    </w:p>
+    <w:p>
+      <w:pPr>
+        <w:pStyle w:val="Normal"/>
+        <w:ind w:left="0"/>
+        <w:jc w:val="left"/>
+      </w:pPr>
+      <w:r>
+        <w:rPr>
+          <w:b w:val="1"/>
+          <w:bCs w:val="1"/>
+          <w:sz w:val="32"/>
+          <w:szCs w:val="32"/>
+        </w:rPr>
+        <w:t>El martes</w:t>
+      </w:r>
+      <w:r>
+        <w:rPr>
+          <w:b w:val="1"/>
+          <w:bCs w:val="1"/>
+          <w:sz w:val="32"/>
+          <w:szCs w:val="32"/>
+        </w:rPr>
+        <w:t xml:space="preserve"> el profesor Joaquín nos dijo que </w:t>
+      </w:r>
+      <w:r>
+        <w:rPr>
+          <w:b w:val="1"/>
+          <w:bCs w:val="1"/>
+          <w:sz w:val="32"/>
+          <w:szCs w:val="32"/>
+        </w:rPr>
+        <w:t>pensáramos</w:t>
+      </w:r>
+      <w:r>
+        <w:rPr>
+          <w:b w:val="1"/>
+          <w:bCs w:val="1"/>
+          <w:sz w:val="32"/>
+          <w:szCs w:val="32"/>
+        </w:rPr>
+        <w:t xml:space="preserve"> en un proyecto viable, </w:t>
+      </w:r>
+      <w:r>
+        <w:rPr>
+          <w:b w:val="1"/>
+          <w:bCs w:val="1"/>
+          <w:sz w:val="32"/>
+          <w:szCs w:val="32"/>
+        </w:rPr>
+        <w:t>escalable</w:t>
+      </w:r>
+      <w:r>
+        <w:rPr>
+          <w:b w:val="1"/>
+          <w:bCs w:val="1"/>
+          <w:sz w:val="32"/>
+          <w:szCs w:val="32"/>
+        </w:rPr>
+        <w:t xml:space="preserve"> y con los recursos necesarios para realizar dicho proyecto, solo </w:t>
+      </w:r>
+      <w:r>
+        <w:rPr>
+          <w:b w:val="1"/>
+          <w:bCs w:val="1"/>
+          <w:sz w:val="32"/>
+          <w:szCs w:val="32"/>
+        </w:rPr>
+        <w:t>fue</w:t>
+      </w:r>
+      <w:r>
+        <w:rPr>
+          <w:b w:val="1"/>
+          <w:bCs w:val="1"/>
+          <w:sz w:val="32"/>
+          <w:szCs w:val="32"/>
+        </w:rPr>
+        <w:t xml:space="preserve"> </w:t>
+      </w:r>
+      <w:r>
+        <w:rPr>
+          <w:b w:val="1"/>
+          <w:bCs w:val="1"/>
+          <w:sz w:val="32"/>
+          <w:szCs w:val="32"/>
+        </w:rPr>
+        <w:t>espontaneo</w:t>
+      </w:r>
+      <w:r>
+        <w:rPr>
+          <w:b w:val="1"/>
+          <w:bCs w:val="1"/>
+          <w:sz w:val="32"/>
+          <w:szCs w:val="32"/>
+        </w:rPr>
+        <w:t xml:space="preserve"> y </w:t>
+      </w:r>
+      <w:r>
+        <w:rPr>
+          <w:b w:val="1"/>
+          <w:bCs w:val="1"/>
+          <w:sz w:val="32"/>
+          <w:szCs w:val="32"/>
+        </w:rPr>
+        <w:t xml:space="preserve">también nos pidió que </w:t>
+      </w:r>
+      <w:r>
+        <w:rPr>
+          <w:b w:val="1"/>
+          <w:bCs w:val="1"/>
+          <w:sz w:val="32"/>
+          <w:szCs w:val="32"/>
+        </w:rPr>
+        <w:t>buscáramos</w:t>
+      </w:r>
+      <w:r>
+        <w:rPr>
+          <w:b w:val="1"/>
+          <w:bCs w:val="1"/>
+          <w:sz w:val="32"/>
+          <w:szCs w:val="32"/>
+        </w:rPr>
+        <w:t xml:space="preserve"> 5 proyectos de compañeros diferentes y cuestionar su proyecto preguntando si es viable, escalable y si contaba con los recurs</w:t>
+      </w:r>
+      <w:r>
+        <w:rPr>
+          <w:b w:val="1"/>
+          <w:bCs w:val="1"/>
+          <w:sz w:val="32"/>
+          <w:szCs w:val="32"/>
+        </w:rPr>
+        <w:t>os.</w:t>
+      </w:r>
+      <w:r>
+        <w:br/>
+      </w:r>
+      <w:r>
+        <w:br/>
+      </w:r>
+      <w:r>
+        <w:rPr>
+          <w:b w:val="1"/>
+          <w:bCs w:val="1"/>
+          <w:sz w:val="32"/>
+          <w:szCs w:val="32"/>
+        </w:rPr>
+        <w:t xml:space="preserve">Pensé en un proyecto de </w:t>
+      </w:r>
+      <w:r>
+        <w:rPr>
+          <w:b w:val="1"/>
+          <w:bCs w:val="1"/>
+          <w:sz w:val="32"/>
+          <w:szCs w:val="32"/>
+        </w:rPr>
+        <w:t>un gestor de actividades que tenga casillas para marcarlos y tenga un apartado do</w:t>
+      </w:r>
+      <w:r>
+        <w:rPr>
+          <w:b w:val="1"/>
+          <w:bCs w:val="1"/>
+          <w:sz w:val="32"/>
+          <w:szCs w:val="32"/>
+        </w:rPr>
+        <w:t>nde pueda</w:t>
+      </w:r>
+      <w:r>
+        <w:rPr>
+          <w:b w:val="1"/>
+          <w:bCs w:val="1"/>
+          <w:sz w:val="32"/>
+          <w:szCs w:val="32"/>
+        </w:rPr>
+        <w:t xml:space="preserve"> dar prioridad a las actividades que realizas a diario o las más importantes</w:t>
+      </w:r>
+      <w:r>
+        <w:rPr>
+          <w:b w:val="1"/>
+          <w:bCs w:val="1"/>
+          <w:sz w:val="32"/>
+          <w:szCs w:val="32"/>
+        </w:rPr>
+        <w:t xml:space="preserve"> de la vida diaria</w:t>
+      </w:r>
     </w:p>
     <w:sectPr>
       <w:pgSz w:w="11906" w:h="16838" w:orient="portrait"/>

</xml_diff>

<commit_message>
En esta modificación agregué el contenido de la clase de forma resumida
</commit_message>
<xml_diff>
--- a/Commit 2.docx
+++ b/Commit 2.docx
@@ -1920,13 +1920,84 @@
         <w:pStyle w:val="Normal"/>
         <w:ind w:left="0"/>
         <w:jc w:val="left"/>
-      </w:pPr>
-      <w:r>
-        <w:rPr>
-          <w:b w:val="1"/>
-          <w:bCs w:val="1"/>
-          <w:sz w:val="32"/>
-          <w:szCs w:val="32"/>
+        <w:rPr>
+          <w:b w:val="1"/>
+          <w:bCs w:val="1"/>
+          <w:sz w:val="32"/>
+          <w:szCs w:val="32"/>
+        </w:rPr>
+      </w:pPr>
+    </w:p>
+    <w:p>
+      <w:pPr>
+        <w:pStyle w:val="Normal"/>
+        <w:ind w:left="0"/>
+        <w:jc w:val="left"/>
+        <w:rPr>
+          <w:b w:val="1"/>
+          <w:bCs w:val="1"/>
+          <w:sz w:val="32"/>
+          <w:szCs w:val="32"/>
+        </w:rPr>
+      </w:pPr>
+    </w:p>
+    <w:p>
+      <w:pPr>
+        <w:pStyle w:val="Normal"/>
+        <w:ind w:left="0"/>
+        <w:jc w:val="left"/>
+        <w:rPr>
+          <w:b w:val="1"/>
+          <w:bCs w:val="1"/>
+          <w:sz w:val="32"/>
+          <w:szCs w:val="32"/>
+        </w:rPr>
+      </w:pPr>
+    </w:p>
+    <w:p>
+      <w:pPr>
+        <w:pStyle w:val="Normal"/>
+        <w:ind w:left="0"/>
+        <w:jc w:val="left"/>
+        <w:rPr>
+          <w:b w:val="1"/>
+          <w:bCs w:val="1"/>
+          <w:sz w:val="32"/>
+          <w:szCs w:val="32"/>
+        </w:rPr>
+      </w:pPr>
+    </w:p>
+    <w:p>
+      <w:pPr>
+        <w:pStyle w:val="Normal"/>
+        <w:ind w:left="0"/>
+        <w:jc w:val="left"/>
+        <w:rPr>
+          <w:b w:val="1"/>
+          <w:bCs w:val="1"/>
+          <w:sz w:val="40"/>
+          <w:szCs w:val="40"/>
+        </w:rPr>
+      </w:pPr>
+    </w:p>
+    <w:p>
+      <w:pPr>
+        <w:pStyle w:val="Normal"/>
+        <w:ind w:left="0"/>
+        <w:jc w:val="left"/>
+        <w:rPr>
+          <w:b w:val="1"/>
+          <w:bCs w:val="1"/>
+          <w:sz w:val="40"/>
+          <w:szCs w:val="40"/>
+        </w:rPr>
+      </w:pPr>
+      <w:r>
+        <w:rPr>
+          <w:b w:val="1"/>
+          <w:bCs w:val="1"/>
+          <w:sz w:val="40"/>
+          <w:szCs w:val="40"/>
         </w:rPr>
         <w:t>Martes</w:t>
       </w:r>
@@ -1936,13 +2007,19 @@
         <w:pStyle w:val="Normal"/>
         <w:ind w:left="0"/>
         <w:jc w:val="left"/>
-      </w:pPr>
-      <w:r>
-        <w:rPr>
-          <w:b w:val="1"/>
-          <w:bCs w:val="1"/>
-          <w:sz w:val="32"/>
-          <w:szCs w:val="32"/>
+        <w:rPr>
+          <w:b w:val="1"/>
+          <w:bCs w:val="1"/>
+          <w:sz w:val="40"/>
+          <w:szCs w:val="40"/>
+        </w:rPr>
+      </w:pPr>
+      <w:r>
+        <w:rPr>
+          <w:b w:val="1"/>
+          <w:bCs w:val="1"/>
+          <w:sz w:val="40"/>
+          <w:szCs w:val="40"/>
         </w:rPr>
         <w:t>El martes</w:t>
       </w:r>
@@ -1950,8 +2027,8 @@
         <w:rPr>
           <w:b w:val="1"/>
           <w:bCs w:val="1"/>
-          <w:sz w:val="32"/>
-          <w:szCs w:val="32"/>
+          <w:sz w:val="40"/>
+          <w:szCs w:val="40"/>
         </w:rPr>
         <w:t xml:space="preserve"> el profesor Joaquín nos dijo que </w:t>
       </w:r>
@@ -1959,8 +2036,8 @@
         <w:rPr>
           <w:b w:val="1"/>
           <w:bCs w:val="1"/>
-          <w:sz w:val="32"/>
-          <w:szCs w:val="32"/>
+          <w:sz w:val="40"/>
+          <w:szCs w:val="40"/>
         </w:rPr>
         <w:t>pensáramos</w:t>
       </w:r>
@@ -1968,8 +2045,8 @@
         <w:rPr>
           <w:b w:val="1"/>
           <w:bCs w:val="1"/>
-          <w:sz w:val="32"/>
-          <w:szCs w:val="32"/>
+          <w:sz w:val="40"/>
+          <w:szCs w:val="40"/>
         </w:rPr>
         <w:t xml:space="preserve"> en un proyecto viable, </w:t>
       </w:r>
@@ -1977,8 +2054,8 @@
         <w:rPr>
           <w:b w:val="1"/>
           <w:bCs w:val="1"/>
-          <w:sz w:val="32"/>
-          <w:szCs w:val="32"/>
+          <w:sz w:val="40"/>
+          <w:szCs w:val="40"/>
         </w:rPr>
         <w:t>escalable</w:t>
       </w:r>
@@ -1986,8 +2063,8 @@
         <w:rPr>
           <w:b w:val="1"/>
           <w:bCs w:val="1"/>
-          <w:sz w:val="32"/>
-          <w:szCs w:val="32"/>
+          <w:sz w:val="40"/>
+          <w:szCs w:val="40"/>
         </w:rPr>
         <w:t xml:space="preserve"> y con los recursos necesarios para realizar dicho proyecto, solo </w:t>
       </w:r>
@@ -1995,8 +2072,8 @@
         <w:rPr>
           <w:b w:val="1"/>
           <w:bCs w:val="1"/>
-          <w:sz w:val="32"/>
-          <w:szCs w:val="32"/>
+          <w:sz w:val="40"/>
+          <w:szCs w:val="40"/>
         </w:rPr>
         <w:t>fue</w:t>
       </w:r>
@@ -2004,8 +2081,8 @@
         <w:rPr>
           <w:b w:val="1"/>
           <w:bCs w:val="1"/>
-          <w:sz w:val="32"/>
-          <w:szCs w:val="32"/>
+          <w:sz w:val="40"/>
+          <w:szCs w:val="40"/>
         </w:rPr>
         <w:t xml:space="preserve"> </w:t>
       </w:r>
@@ -2013,8 +2090,8 @@
         <w:rPr>
           <w:b w:val="1"/>
           <w:bCs w:val="1"/>
-          <w:sz w:val="32"/>
-          <w:szCs w:val="32"/>
+          <w:sz w:val="40"/>
+          <w:szCs w:val="40"/>
         </w:rPr>
         <w:t>espontaneo</w:t>
       </w:r>
@@ -2022,8 +2099,8 @@
         <w:rPr>
           <w:b w:val="1"/>
           <w:bCs w:val="1"/>
-          <w:sz w:val="32"/>
-          <w:szCs w:val="32"/>
+          <w:sz w:val="40"/>
+          <w:szCs w:val="40"/>
         </w:rPr>
         <w:t xml:space="preserve"> y </w:t>
       </w:r>
@@ -2031,8 +2108,8 @@
         <w:rPr>
           <w:b w:val="1"/>
           <w:bCs w:val="1"/>
-          <w:sz w:val="32"/>
-          <w:szCs w:val="32"/>
+          <w:sz w:val="40"/>
+          <w:szCs w:val="40"/>
         </w:rPr>
         <w:t xml:space="preserve">también nos pidió que </w:t>
       </w:r>
@@ -2040,8 +2117,8 @@
         <w:rPr>
           <w:b w:val="1"/>
           <w:bCs w:val="1"/>
-          <w:sz w:val="32"/>
-          <w:szCs w:val="32"/>
+          <w:sz w:val="40"/>
+          <w:szCs w:val="40"/>
         </w:rPr>
         <w:t>buscáramos</w:t>
       </w:r>
@@ -2049,8 +2126,8 @@
         <w:rPr>
           <w:b w:val="1"/>
           <w:bCs w:val="1"/>
-          <w:sz w:val="32"/>
-          <w:szCs w:val="32"/>
+          <w:sz w:val="40"/>
+          <w:szCs w:val="40"/>
         </w:rPr>
         <w:t xml:space="preserve"> 5 proyectos de compañeros diferentes y cuestionar su proyecto preguntando si es viable, escalable y si contaba con los recurs</w:t>
       </w:r>
@@ -2058,8 +2135,8 @@
         <w:rPr>
           <w:b w:val="1"/>
           <w:bCs w:val="1"/>
-          <w:sz w:val="32"/>
-          <w:szCs w:val="32"/>
+          <w:sz w:val="40"/>
+          <w:szCs w:val="40"/>
         </w:rPr>
         <w:t>os.</w:t>
       </w:r>
@@ -2073,8 +2150,8 @@
         <w:rPr>
           <w:b w:val="1"/>
           <w:bCs w:val="1"/>
-          <w:sz w:val="32"/>
-          <w:szCs w:val="32"/>
+          <w:sz w:val="40"/>
+          <w:szCs w:val="40"/>
         </w:rPr>
         <w:t xml:space="preserve">Pensé en un proyecto de </w:t>
       </w:r>
@@ -2082,8 +2159,8 @@
         <w:rPr>
           <w:b w:val="1"/>
           <w:bCs w:val="1"/>
-          <w:sz w:val="32"/>
-          <w:szCs w:val="32"/>
+          <w:sz w:val="40"/>
+          <w:szCs w:val="40"/>
         </w:rPr>
         <w:t>un gestor de actividades que tenga casillas para marcarlos y tenga un apartado do</w:t>
       </w:r>
@@ -2091,8 +2168,8 @@
         <w:rPr>
           <w:b w:val="1"/>
           <w:bCs w:val="1"/>
-          <w:sz w:val="32"/>
-          <w:szCs w:val="32"/>
+          <w:sz w:val="40"/>
+          <w:szCs w:val="40"/>
         </w:rPr>
         <w:t>nde pueda</w:t>
       </w:r>
@@ -2100,8 +2177,8 @@
         <w:rPr>
           <w:b w:val="1"/>
           <w:bCs w:val="1"/>
-          <w:sz w:val="32"/>
-          <w:szCs w:val="32"/>
+          <w:sz w:val="40"/>
+          <w:szCs w:val="40"/>
         </w:rPr>
         <w:t xml:space="preserve"> dar prioridad a las actividades que realizas a diario o las más importantes</w:t>
       </w:r>
@@ -2109,10 +2186,545 @@
         <w:rPr>
           <w:b w:val="1"/>
           <w:bCs w:val="1"/>
-          <w:sz w:val="32"/>
-          <w:szCs w:val="32"/>
+          <w:sz w:val="40"/>
+          <w:szCs w:val="40"/>
         </w:rPr>
         <w:t xml:space="preserve"> de la vida diaria</w:t>
+      </w:r>
+    </w:p>
+    <w:p>
+      <w:pPr>
+        <w:pStyle w:val="Normal"/>
+        <w:ind w:left="0"/>
+        <w:jc w:val="left"/>
+        <w:rPr>
+          <w:b w:val="1"/>
+          <w:bCs w:val="1"/>
+          <w:sz w:val="32"/>
+          <w:szCs w:val="32"/>
+        </w:rPr>
+      </w:pPr>
+    </w:p>
+    <w:p>
+      <w:pPr>
+        <w:pStyle w:val="Normal"/>
+        <w:ind w:left="0"/>
+        <w:jc w:val="left"/>
+        <w:rPr>
+          <w:b w:val="1"/>
+          <w:bCs w:val="1"/>
+          <w:sz w:val="32"/>
+          <w:szCs w:val="32"/>
+        </w:rPr>
+      </w:pPr>
+    </w:p>
+    <w:p>
+      <w:pPr>
+        <w:pStyle w:val="Normal"/>
+        <w:ind w:left="0"/>
+        <w:jc w:val="left"/>
+        <w:rPr>
+          <w:b w:val="1"/>
+          <w:bCs w:val="1"/>
+          <w:sz w:val="32"/>
+          <w:szCs w:val="32"/>
+        </w:rPr>
+      </w:pPr>
+    </w:p>
+    <w:p>
+      <w:pPr>
+        <w:pStyle w:val="Normal"/>
+        <w:ind w:left="0"/>
+        <w:jc w:val="left"/>
+        <w:rPr>
+          <w:b w:val="1"/>
+          <w:bCs w:val="1"/>
+          <w:sz w:val="32"/>
+          <w:szCs w:val="32"/>
+        </w:rPr>
+      </w:pPr>
+    </w:p>
+    <w:p>
+      <w:pPr>
+        <w:pStyle w:val="Normal"/>
+        <w:ind w:left="0"/>
+        <w:jc w:val="left"/>
+        <w:rPr>
+          <w:b w:val="1"/>
+          <w:bCs w:val="1"/>
+          <w:sz w:val="32"/>
+          <w:szCs w:val="32"/>
+        </w:rPr>
+      </w:pPr>
+    </w:p>
+    <w:p>
+      <w:pPr>
+        <w:pStyle w:val="Normal"/>
+        <w:ind w:left="0"/>
+        <w:jc w:val="left"/>
+        <w:rPr>
+          <w:b w:val="1"/>
+          <w:bCs w:val="1"/>
+          <w:sz w:val="32"/>
+          <w:szCs w:val="32"/>
+        </w:rPr>
+      </w:pPr>
+    </w:p>
+    <w:p>
+      <w:pPr>
+        <w:pStyle w:val="Normal"/>
+        <w:ind w:left="0"/>
+        <w:jc w:val="left"/>
+        <w:rPr>
+          <w:b w:val="1"/>
+          <w:bCs w:val="1"/>
+          <w:sz w:val="32"/>
+          <w:szCs w:val="32"/>
+        </w:rPr>
+      </w:pPr>
+    </w:p>
+    <w:p>
+      <w:pPr>
+        <w:pStyle w:val="Normal"/>
+        <w:ind w:left="0"/>
+        <w:jc w:val="left"/>
+        <w:rPr>
+          <w:b w:val="1"/>
+          <w:bCs w:val="1"/>
+          <w:sz w:val="32"/>
+          <w:szCs w:val="32"/>
+        </w:rPr>
+      </w:pPr>
+    </w:p>
+    <w:p>
+      <w:pPr>
+        <w:pStyle w:val="Normal"/>
+        <w:ind w:left="0"/>
+        <w:jc w:val="left"/>
+        <w:rPr>
+          <w:b w:val="1"/>
+          <w:bCs w:val="1"/>
+          <w:sz w:val="32"/>
+          <w:szCs w:val="32"/>
+        </w:rPr>
+      </w:pPr>
+      <w:r>
+        <w:rPr>
+          <w:b w:val="1"/>
+          <w:bCs w:val="1"/>
+          <w:sz w:val="32"/>
+          <w:szCs w:val="32"/>
+        </w:rPr>
+        <w:t>Miercoles</w:t>
+      </w:r>
+      <w:r>
+        <w:br/>
+      </w:r>
+      <w:r>
+        <w:rPr>
+          <w:b w:val="1"/>
+          <w:bCs w:val="1"/>
+          <w:sz w:val="32"/>
+          <w:szCs w:val="32"/>
+        </w:rPr>
+        <w:t xml:space="preserve">El </w:t>
+      </w:r>
+      <w:r>
+        <w:rPr>
+          <w:b w:val="1"/>
+          <w:bCs w:val="1"/>
+          <w:sz w:val="32"/>
+          <w:szCs w:val="32"/>
+        </w:rPr>
+        <w:t>miércoles</w:t>
+      </w:r>
+      <w:r>
+        <w:rPr>
+          <w:b w:val="1"/>
+          <w:bCs w:val="1"/>
+          <w:sz w:val="32"/>
+          <w:szCs w:val="32"/>
+        </w:rPr>
+        <w:t xml:space="preserve"> volvimos a retomar la función Ackley y el profe</w:t>
+      </w:r>
+      <w:r>
+        <w:rPr>
+          <w:b w:val="1"/>
+          <w:bCs w:val="1"/>
+          <w:sz w:val="32"/>
+          <w:szCs w:val="32"/>
+        </w:rPr>
+        <w:t xml:space="preserve"> nos </w:t>
+      </w:r>
+      <w:r>
+        <w:rPr>
+          <w:b w:val="1"/>
+          <w:bCs w:val="1"/>
+          <w:sz w:val="32"/>
+          <w:szCs w:val="32"/>
+        </w:rPr>
+        <w:t>dio</w:t>
+      </w:r>
+      <w:r>
+        <w:rPr>
+          <w:b w:val="1"/>
+          <w:bCs w:val="1"/>
+          <w:sz w:val="32"/>
+          <w:szCs w:val="32"/>
+        </w:rPr>
+        <w:t xml:space="preserve"> vectores diferentes para </w:t>
+      </w:r>
+      <w:r>
+        <w:rPr>
+          <w:b w:val="1"/>
+          <w:bCs w:val="1"/>
+          <w:sz w:val="32"/>
+          <w:szCs w:val="32"/>
+        </w:rPr>
+        <w:t>resolverla</w:t>
+      </w:r>
+      <w:r>
+        <w:rPr>
+          <w:b w:val="1"/>
+          <w:bCs w:val="1"/>
+          <w:sz w:val="32"/>
+          <w:szCs w:val="32"/>
+        </w:rPr>
+        <w:t xml:space="preserve"> nuevamente, pero antes nos </w:t>
+      </w:r>
+      <w:r>
+        <w:rPr>
+          <w:b w:val="1"/>
+          <w:bCs w:val="1"/>
+          <w:sz w:val="32"/>
+          <w:szCs w:val="32"/>
+        </w:rPr>
+        <w:t>pidió</w:t>
+      </w:r>
+      <w:r>
+        <w:rPr>
+          <w:b w:val="1"/>
+          <w:bCs w:val="1"/>
+          <w:sz w:val="32"/>
+          <w:szCs w:val="32"/>
+        </w:rPr>
+        <w:t xml:space="preserve"> que </w:t>
+      </w:r>
+      <w:r>
+        <w:rPr>
+          <w:b w:val="1"/>
+          <w:bCs w:val="1"/>
+          <w:sz w:val="32"/>
+          <w:szCs w:val="32"/>
+        </w:rPr>
+        <w:t>hiciéramos</w:t>
+      </w:r>
+      <w:r>
+        <w:rPr>
+          <w:b w:val="1"/>
+          <w:bCs w:val="1"/>
+          <w:sz w:val="32"/>
+          <w:szCs w:val="32"/>
+        </w:rPr>
+        <w:t xml:space="preserve"> una sumatoria antes de </w:t>
+      </w:r>
+      <w:r>
+        <w:rPr>
+          <w:b w:val="1"/>
+          <w:bCs w:val="1"/>
+          <w:sz w:val="32"/>
+          <w:szCs w:val="32"/>
+        </w:rPr>
+        <w:t>empezar</w:t>
+      </w:r>
+      <w:r>
+        <w:rPr>
+          <w:b w:val="1"/>
+          <w:bCs w:val="1"/>
+          <w:sz w:val="32"/>
+          <w:szCs w:val="32"/>
+        </w:rPr>
+        <w:t xml:space="preserve"> con la ecuación de función de x, los vectores de x nuevos eran x (2,1,-1), x2(0,0,0), </w:t>
+      </w:r>
+      <w:r>
+        <w:rPr>
+          <w:b w:val="1"/>
+          <w:bCs w:val="1"/>
+          <w:sz w:val="32"/>
+          <w:szCs w:val="32"/>
+        </w:rPr>
+        <w:t>aquí</w:t>
+      </w:r>
+      <w:r>
+        <w:rPr>
+          <w:b w:val="1"/>
+          <w:bCs w:val="1"/>
+          <w:sz w:val="32"/>
+          <w:szCs w:val="32"/>
+        </w:rPr>
+        <w:t xml:space="preserve"> la evidencia</w:t>
+      </w:r>
+      <w:r>
+        <w:drawing>
+          <wp:inline wp14:editId="36968E71" wp14:anchorId="267EBEB0">
+            <wp:extent cx="2088656" cy="3713854"/>
+            <wp:effectExtent l="0" t="0" r="0" b="0"/>
+            <wp:docPr id="1008953842" name="drawing"/>
+            <wp:cNvGraphicFramePr>
+              <a:graphicFrameLocks noChangeAspect="1"/>
+            </wp:cNvGraphicFramePr>
+            <a:graphic>
+              <a:graphicData xmlns:a="http://schemas.openxmlformats.org/drawingml/2006/main" uri="http://schemas.openxmlformats.org/drawingml/2006/picture">
+                <pic:pic xmlns:pic="http://schemas.openxmlformats.org/drawingml/2006/picture">
+                  <pic:nvPicPr>
+                    <pic:cNvPr id="1008953842" name="Picture 1008953842"/>
+                    <pic:cNvPicPr/>
+                  </pic:nvPicPr>
+                  <pic:blipFill>
+                    <a:blip xmlns:r="http://schemas.openxmlformats.org/officeDocument/2006/relationships" r:embed="rId732438114">
+                      <a:extLst>
+                        <a:ext uri="{28A0092B-C50C-407E-A947-70E740481C1C}">
+                          <a14:useLocalDpi xmlns:a14="http://schemas.microsoft.com/office/drawing/2010/main"/>
+                        </a:ext>
+                      </a:extLst>
+                    </a:blip>
+                    <a:stretch>
+                      <a:fillRect/>
+                    </a:stretch>
+                  </pic:blipFill>
+                  <pic:spPr>
+                    <a:xfrm rot="0">
+                      <a:off x="0" y="0"/>
+                      <a:ext cx="2088656" cy="3713854"/>
+                    </a:xfrm>
+                    <a:prstGeom prst="rect">
+                      <a:avLst/>
+                    </a:prstGeom>
+                  </pic:spPr>
+                </pic:pic>
+              </a:graphicData>
+            </a:graphic>
+          </wp:inline>
+        </w:drawing>
+      </w:r>
+    </w:p>
+    <w:p>
+      <w:pPr>
+        <w:pStyle w:val="Normal"/>
+        <w:ind w:left="0"/>
+        <w:jc w:val="left"/>
+        <w:rPr>
+          <w:b w:val="1"/>
+          <w:bCs w:val="1"/>
+          <w:sz w:val="32"/>
+          <w:szCs w:val="32"/>
+        </w:rPr>
+      </w:pPr>
+    </w:p>
+    <w:p>
+      <w:pPr>
+        <w:pStyle w:val="Normal"/>
+        <w:ind w:left="0"/>
+        <w:jc w:val="left"/>
+        <w:rPr>
+          <w:b w:val="1"/>
+          <w:bCs w:val="1"/>
+          <w:sz w:val="32"/>
+          <w:szCs w:val="32"/>
+        </w:rPr>
+      </w:pPr>
+    </w:p>
+    <w:p>
+      <w:pPr>
+        <w:pStyle w:val="Normal"/>
+        <w:ind w:left="0"/>
+        <w:jc w:val="left"/>
+        <w:rPr>
+          <w:b w:val="1"/>
+          <w:bCs w:val="1"/>
+          <w:sz w:val="32"/>
+          <w:szCs w:val="32"/>
+        </w:rPr>
+      </w:pPr>
+    </w:p>
+    <w:p>
+      <w:pPr>
+        <w:pStyle w:val="Normal"/>
+        <w:ind w:left="0"/>
+        <w:jc w:val="left"/>
+        <w:rPr>
+          <w:b w:val="1"/>
+          <w:bCs w:val="1"/>
+          <w:sz w:val="32"/>
+          <w:szCs w:val="32"/>
+        </w:rPr>
+      </w:pPr>
+    </w:p>
+    <w:p>
+      <w:pPr>
+        <w:pStyle w:val="Normal"/>
+        <w:ind w:left="0"/>
+        <w:jc w:val="left"/>
+      </w:pPr>
+      <w:r>
+        <w:rPr>
+          <w:b w:val="1"/>
+          <w:bCs w:val="1"/>
+          <w:sz w:val="32"/>
+          <w:szCs w:val="32"/>
+        </w:rPr>
+        <w:t>Jueves</w:t>
+      </w:r>
+    </w:p>
+    <w:p>
+      <w:pPr>
+        <w:pStyle w:val="Normal"/>
+        <w:ind w:left="0"/>
+        <w:jc w:val="left"/>
+        <w:rPr>
+          <w:b w:val="1"/>
+          <w:bCs w:val="1"/>
+          <w:sz w:val="32"/>
+          <w:szCs w:val="32"/>
+        </w:rPr>
+      </w:pPr>
+      <w:r>
+        <w:rPr>
+          <w:b w:val="1"/>
+          <w:bCs w:val="1"/>
+          <w:sz w:val="32"/>
+          <w:szCs w:val="32"/>
+        </w:rPr>
+        <w:t xml:space="preserve">El jueves de nuevo el profe nos dio uno minutos para buscar 7 proyectos con el nombre y de que trata el proyecto, después </w:t>
+      </w:r>
+      <w:r>
+        <w:rPr>
+          <w:b w:val="1"/>
+          <w:bCs w:val="1"/>
+          <w:sz w:val="32"/>
+          <w:szCs w:val="32"/>
+        </w:rPr>
+        <w:t xml:space="preserve">nos dijo que </w:t>
+      </w:r>
+      <w:r>
+        <w:rPr>
+          <w:b w:val="1"/>
+          <w:bCs w:val="1"/>
+          <w:sz w:val="32"/>
+          <w:szCs w:val="32"/>
+        </w:rPr>
+        <w:t>hiciéramos</w:t>
+      </w:r>
+      <w:r>
+        <w:rPr>
+          <w:b w:val="1"/>
+          <w:bCs w:val="1"/>
+          <w:sz w:val="32"/>
+          <w:szCs w:val="32"/>
+        </w:rPr>
+        <w:t xml:space="preserve"> grupos de 2 a 3 personas y ya con equipo nos dijo que </w:t>
+      </w:r>
+      <w:r>
+        <w:rPr>
+          <w:b w:val="1"/>
+          <w:bCs w:val="1"/>
+          <w:sz w:val="32"/>
+          <w:szCs w:val="32"/>
+        </w:rPr>
+        <w:t>teníamos</w:t>
+      </w:r>
+      <w:r>
+        <w:rPr>
+          <w:b w:val="1"/>
+          <w:bCs w:val="1"/>
+          <w:sz w:val="32"/>
+          <w:szCs w:val="32"/>
+        </w:rPr>
+        <w:t xml:space="preserve"> que hacer un anteproyecto, que es antes del proyecto y que </w:t>
+      </w:r>
+      <w:r>
+        <w:rPr>
+          <w:b w:val="1"/>
+          <w:bCs w:val="1"/>
+          <w:sz w:val="32"/>
+          <w:szCs w:val="32"/>
+        </w:rPr>
+        <w:t>decidiéramos</w:t>
+      </w:r>
+      <w:r>
+        <w:rPr>
+          <w:b w:val="1"/>
+          <w:bCs w:val="1"/>
+          <w:sz w:val="32"/>
+          <w:szCs w:val="32"/>
+        </w:rPr>
+        <w:t xml:space="preserve"> que proyecto haríamos y nos dejó varios puntos para buscar sobre el proyecto</w:t>
+      </w:r>
+      <w:r>
+        <w:rPr>
+          <w:b w:val="1"/>
+          <w:bCs w:val="1"/>
+          <w:sz w:val="32"/>
+          <w:szCs w:val="32"/>
+        </w:rPr>
+        <w:t>.</w:t>
+      </w:r>
+      <w:r>
+        <w:drawing>
+          <wp:anchor distT="0" distB="0" distL="114300" distR="114300" simplePos="0" relativeHeight="251658240" behindDoc="0" locked="0" layoutInCell="1" allowOverlap="1" wp14:editId="054D7BD5" wp14:anchorId="56145349">
+            <wp:simplePos x="0" y="0"/>
+            <wp:positionH relativeFrom="column">
+              <wp:posOffset>1552575</wp:posOffset>
+            </wp:positionH>
+            <wp:positionV relativeFrom="paragraph">
+              <wp:posOffset>2695575</wp:posOffset>
+            </wp:positionV>
+            <wp:extent cx="2437354" cy="4333875"/>
+            <wp:effectExtent l="0" t="0" r="0" b="0"/>
+            <wp:wrapNone/>
+            <wp:docPr id="1857088030" name="drawing"/>
+            <wp:cNvGraphicFramePr>
+              <a:graphicFrameLocks noChangeAspect="1"/>
+            </wp:cNvGraphicFramePr>
+            <a:graphic>
+              <a:graphicData xmlns:a="http://schemas.openxmlformats.org/drawingml/2006/main" uri="http://schemas.openxmlformats.org/drawingml/2006/picture">
+                <pic:pic xmlns:pic="http://schemas.openxmlformats.org/drawingml/2006/picture">
+                  <pic:nvPicPr>
+                    <pic:cNvPr id="1857088030" name="Picture 1857088030"/>
+                    <pic:cNvPicPr/>
+                  </pic:nvPicPr>
+                  <pic:blipFill>
+                    <a:blip xmlns:r="http://schemas.openxmlformats.org/officeDocument/2006/relationships" r:embed="rId978339606">
+                      <a:extLst>
+                        <a:ext uri="{28A0092B-C50C-407E-A947-70E740481C1C}">
+                          <a14:useLocalDpi xmlns:a14="http://schemas.microsoft.com/office/drawing/2010/main"/>
+                        </a:ext>
+                      </a:extLst>
+                    </a:blip>
+                    <a:stretch>
+                      <a:fillRect/>
+                    </a:stretch>
+                  </pic:blipFill>
+                  <pic:spPr>
+                    <a:xfrm rot="0">
+                      <a:off x="0" y="0"/>
+                      <a:ext cx="2437354" cy="4333875"/>
+                    </a:xfrm>
+                    <a:prstGeom prst="rect">
+                      <a:avLst/>
+                    </a:prstGeom>
+                  </pic:spPr>
+                </pic:pic>
+              </a:graphicData>
+            </a:graphic>
+            <wp14:sizeRelH relativeFrom="page">
+              <wp14:pctWidth>0</wp14:pctWidth>
+            </wp14:sizeRelH>
+            <wp14:sizeRelV relativeFrom="page">
+              <wp14:pctHeight>0</wp14:pctHeight>
+            </wp14:sizeRelV>
+          </wp:anchor>
+        </w:drawing>
       </w:r>
     </w:p>
     <w:sectPr>

</xml_diff>